<commit_message>
feat: complete phase 1 authentication system (JWT, protected routes, auto login)
</commit_message>
<xml_diff>
--- a/AI Job Preparation Platform.docx
+++ b/AI Job Preparation Platform.docx
@@ -9,6 +9,92 @@
           <w:bCs/>
         </w:rPr>
       </w:pPr>
+    </w:p>
+    <w:p>
+      <w:pPr>
+        <w:rPr>
+          <w:b/>
+          <w:bCs/>
+        </w:rPr>
+      </w:pPr>
+      <w:proofErr w:type="spellStart"/>
+      <w:r>
+        <w:rPr>
+          <w:b/>
+          <w:bCs/>
+        </w:rPr>
+        <w:t>pGQgBVlDbRiQyarP</w:t>
+      </w:r>
+      <w:proofErr w:type="spellEnd"/>
+      <w:r>
+        <w:rPr>
+          <w:b/>
+          <w:bCs/>
+        </w:rPr>
+        <w:br/>
+      </w:r>
+      <w:proofErr w:type="spellStart"/>
+      <w:r>
+        <w:rPr>
+          <w:b/>
+          <w:bCs/>
+        </w:rPr>
+        <w:t>mongodb+srv</w:t>
+      </w:r>
+      <w:proofErr w:type="spellEnd"/>
+      <w:r>
+        <w:rPr>
+          <w:b/>
+          <w:bCs/>
+        </w:rPr>
+        <w:t>://janhvipagare3_db_user:</w:t>
+      </w:r>
+      <w:r>
+        <w:rPr>
+          <w:b/>
+          <w:bCs/>
+        </w:rPr>
+        <w:t xml:space="preserve"> </w:t>
+      </w:r>
+      <w:proofErr w:type="spellStart"/>
+      <w:r>
+        <w:rPr>
+          <w:b/>
+          <w:bCs/>
+        </w:rPr>
+        <w:t>pGQgBVlDbRiQyarP</w:t>
+      </w:r>
+      <w:proofErr w:type="spellEnd"/>
+      <w:r>
+        <w:rPr>
+          <w:b/>
+          <w:bCs/>
+        </w:rPr>
+        <w:t xml:space="preserve"> </w:t>
+      </w:r>
+      <w:r>
+        <w:rPr>
+          <w:b/>
+          <w:bCs/>
+        </w:rPr>
+        <w:t>@cluster0.fiyywdl.mongodb.net/?appName=Cluster0</w:t>
+      </w:r>
+    </w:p>
+    <w:p>
+      <w:pPr>
+        <w:rPr>
+          <w:b/>
+          <w:bCs/>
+        </w:rPr>
+      </w:pPr>
+    </w:p>
+    <w:p>
+      <w:pPr>
+        <w:rPr>
+          <w:b/>
+          <w:bCs/>
+        </w:rPr>
+      </w:pPr>
       <w:r>
         <w:rPr>
           <w:b/>
@@ -269,6 +355,7 @@
     </w:p>
     <w:p>
       <w:r>
+        <w:lastRenderedPageBreak/>
         <w:pict w14:anchorId="294A9836">
           <v:rect id="_x0000_i1026" style="width:0;height:1.5pt" o:hralign="center" o:hrstd="t" o:hr="t" fillcolor="#a0a0a0" stroked="f"/>
         </w:pict>
@@ -323,283 +410,294 @@
         </w:numPr>
       </w:pPr>
       <w:r>
+        <w:t>Vite</w:t>
+      </w:r>
+    </w:p>
+    <w:p>
+      <w:pPr>
+        <w:numPr>
+          <w:ilvl w:val="0"/>
+          <w:numId w:val="3"/>
+        </w:numPr>
+      </w:pPr>
+      <w:r>
+        <w:t>React Router DOM</w:t>
+      </w:r>
+    </w:p>
+    <w:p>
+      <w:pPr>
+        <w:numPr>
+          <w:ilvl w:val="0"/>
+          <w:numId w:val="3"/>
+        </w:numPr>
+      </w:pPr>
+      <w:r>
+        <w:t>Axios</w:t>
+      </w:r>
+    </w:p>
+    <w:p>
+      <w:pPr>
+        <w:numPr>
+          <w:ilvl w:val="0"/>
+          <w:numId w:val="3"/>
+        </w:numPr>
+      </w:pPr>
+      <w:r>
+        <w:t>SCSS</w:t>
+      </w:r>
+    </w:p>
+    <w:p>
+      <w:pPr>
+        <w:numPr>
+          <w:ilvl w:val="0"/>
+          <w:numId w:val="3"/>
+        </w:numPr>
+      </w:pPr>
+      <w:r>
+        <w:t>React Hook Form</w:t>
+      </w:r>
+    </w:p>
+    <w:p>
+      <w:pPr>
+        <w:rPr>
+          <w:b/>
+          <w:bCs/>
+        </w:rPr>
+      </w:pPr>
+      <w:r>
+        <w:rPr>
+          <w:b/>
+          <w:bCs/>
+        </w:rPr>
+        <w:t>Backend</w:t>
+      </w:r>
+    </w:p>
+    <w:p>
+      <w:pPr>
+        <w:numPr>
+          <w:ilvl w:val="0"/>
+          <w:numId w:val="4"/>
+        </w:numPr>
+      </w:pPr>
+      <w:r>
+        <w:t>Node.js</w:t>
+      </w:r>
+    </w:p>
+    <w:p>
+      <w:pPr>
+        <w:numPr>
+          <w:ilvl w:val="0"/>
+          <w:numId w:val="4"/>
+        </w:numPr>
+      </w:pPr>
+      <w:r>
+        <w:t>Express.js</w:t>
+      </w:r>
+    </w:p>
+    <w:p>
+      <w:pPr>
+        <w:numPr>
+          <w:ilvl w:val="0"/>
+          <w:numId w:val="4"/>
+        </w:numPr>
+      </w:pPr>
+      <w:r>
+        <w:t>JWT Authentication</w:t>
+      </w:r>
+    </w:p>
+    <w:p>
+      <w:pPr>
+        <w:numPr>
+          <w:ilvl w:val="0"/>
+          <w:numId w:val="4"/>
+        </w:numPr>
+      </w:pPr>
+      <w:proofErr w:type="spellStart"/>
+      <w:r>
+        <w:t>bcryptjs</w:t>
+      </w:r>
+      <w:proofErr w:type="spellEnd"/>
+    </w:p>
+    <w:p>
+      <w:pPr>
+        <w:numPr>
+          <w:ilvl w:val="0"/>
+          <w:numId w:val="4"/>
+        </w:numPr>
+      </w:pPr>
+      <w:r>
+        <w:t>Multer</w:t>
+      </w:r>
+    </w:p>
+    <w:p>
+      <w:pPr>
+        <w:numPr>
+          <w:ilvl w:val="0"/>
+          <w:numId w:val="4"/>
+        </w:numPr>
+      </w:pPr>
+      <w:r>
+        <w:t>Zod</w:t>
+      </w:r>
+    </w:p>
+    <w:p>
+      <w:pPr>
+        <w:numPr>
+          <w:ilvl w:val="0"/>
+          <w:numId w:val="4"/>
+        </w:numPr>
+      </w:pPr>
+      <w:r>
+        <w:t>pdf-parse</w:t>
+      </w:r>
+    </w:p>
+    <w:p>
+      <w:pPr>
+        <w:rPr>
+          <w:b/>
+          <w:bCs/>
+        </w:rPr>
+      </w:pPr>
+      <w:r>
+        <w:rPr>
+          <w:b/>
+          <w:bCs/>
+        </w:rPr>
+        <w:t>Database</w:t>
+      </w:r>
+    </w:p>
+    <w:p>
+      <w:pPr>
+        <w:numPr>
+          <w:ilvl w:val="0"/>
+          <w:numId w:val="5"/>
+        </w:numPr>
+      </w:pPr>
+      <w:r>
+        <w:t>MongoDB Atlas</w:t>
+      </w:r>
+    </w:p>
+    <w:p>
+      <w:pPr>
+        <w:numPr>
+          <w:ilvl w:val="0"/>
+          <w:numId w:val="5"/>
+        </w:numPr>
+      </w:pPr>
+      <w:r>
+        <w:t>Mongoose</w:t>
+      </w:r>
+    </w:p>
+    <w:p>
+      <w:pPr>
+        <w:rPr>
+          <w:b/>
+          <w:bCs/>
+        </w:rPr>
+      </w:pPr>
+      <w:r>
+        <w:rPr>
+          <w:b/>
+          <w:bCs/>
+        </w:rPr>
+        <w:t>AI</w:t>
+      </w:r>
+    </w:p>
+    <w:p>
+      <w:pPr>
+        <w:numPr>
+          <w:ilvl w:val="0"/>
+          <w:numId w:val="6"/>
+        </w:numPr>
+      </w:pPr>
+      <w:r>
+        <w:t>Google Gemini API</w:t>
+      </w:r>
+    </w:p>
+    <w:p>
+      <w:pPr>
+        <w:numPr>
+          <w:ilvl w:val="0"/>
+          <w:numId w:val="6"/>
+        </w:numPr>
+      </w:pPr>
+      <w:r>
+        <w:t>Prompt Engineering</w:t>
+      </w:r>
+    </w:p>
+    <w:p>
+      <w:pPr>
+        <w:numPr>
+          <w:ilvl w:val="0"/>
+          <w:numId w:val="6"/>
+        </w:numPr>
+      </w:pPr>
+      <w:r>
+        <w:t>Response Schema</w:t>
+      </w:r>
+    </w:p>
+    <w:p>
+      <w:pPr>
+        <w:numPr>
+          <w:ilvl w:val="0"/>
+          <w:numId w:val="6"/>
+        </w:numPr>
+      </w:pPr>
+      <w:r>
+        <w:t>Structured JSON Output</w:t>
+      </w:r>
+    </w:p>
+    <w:p>
+      <w:pPr>
+        <w:rPr>
+          <w:b/>
+          <w:bCs/>
+        </w:rPr>
+      </w:pPr>
+      <w:r>
+        <w:rPr>
+          <w:b/>
+          <w:bCs/>
+        </w:rPr>
+        <w:t>PDF</w:t>
+      </w:r>
+    </w:p>
+    <w:p>
+      <w:pPr>
+        <w:numPr>
+          <w:ilvl w:val="0"/>
+          <w:numId w:val="7"/>
+        </w:numPr>
+      </w:pPr>
+      <w:r>
+        <w:t>Puppeteer</w:t>
+      </w:r>
+    </w:p>
+    <w:p>
+      <w:pPr>
+        <w:rPr>
+          <w:b/>
+          <w:bCs/>
+        </w:rPr>
+      </w:pPr>
+      <w:r>
+        <w:rPr>
+          <w:b/>
+          <w:bCs/>
+        </w:rPr>
+        <w:t>Authentication</w:t>
+      </w:r>
+    </w:p>
+    <w:p>
+      <w:pPr>
+        <w:numPr>
+          <w:ilvl w:val="0"/>
+          <w:numId w:val="8"/>
+        </w:numPr>
+      </w:pPr>
+      <w:r>
         <w:lastRenderedPageBreak/>
-        <w:t>Vite</w:t>
-      </w:r>
-    </w:p>
-    <w:p>
-      <w:pPr>
-        <w:numPr>
-          <w:ilvl w:val="0"/>
-          <w:numId w:val="3"/>
-        </w:numPr>
-      </w:pPr>
-      <w:r>
-        <w:t>React Router DOM</w:t>
-      </w:r>
-    </w:p>
-    <w:p>
-      <w:pPr>
-        <w:numPr>
-          <w:ilvl w:val="0"/>
-          <w:numId w:val="3"/>
-        </w:numPr>
-      </w:pPr>
-      <w:r>
-        <w:t>Axios</w:t>
-      </w:r>
-    </w:p>
-    <w:p>
-      <w:pPr>
-        <w:numPr>
-          <w:ilvl w:val="0"/>
-          <w:numId w:val="3"/>
-        </w:numPr>
-      </w:pPr>
-      <w:r>
-        <w:t>SCSS</w:t>
-      </w:r>
-    </w:p>
-    <w:p>
-      <w:pPr>
-        <w:numPr>
-          <w:ilvl w:val="0"/>
-          <w:numId w:val="3"/>
-        </w:numPr>
-      </w:pPr>
-      <w:r>
-        <w:t>React Hook Form</w:t>
-      </w:r>
-    </w:p>
-    <w:p>
-      <w:pPr>
-        <w:rPr>
-          <w:b/>
-          <w:bCs/>
-        </w:rPr>
-      </w:pPr>
-      <w:r>
-        <w:rPr>
-          <w:b/>
-          <w:bCs/>
-        </w:rPr>
-        <w:t>Backend</w:t>
-      </w:r>
-    </w:p>
-    <w:p>
-      <w:pPr>
-        <w:numPr>
-          <w:ilvl w:val="0"/>
-          <w:numId w:val="4"/>
-        </w:numPr>
-      </w:pPr>
-      <w:r>
-        <w:t>Node.js</w:t>
-      </w:r>
-    </w:p>
-    <w:p>
-      <w:pPr>
-        <w:numPr>
-          <w:ilvl w:val="0"/>
-          <w:numId w:val="4"/>
-        </w:numPr>
-      </w:pPr>
-      <w:r>
-        <w:t>Express.js</w:t>
-      </w:r>
-    </w:p>
-    <w:p>
-      <w:pPr>
-        <w:numPr>
-          <w:ilvl w:val="0"/>
-          <w:numId w:val="4"/>
-        </w:numPr>
-      </w:pPr>
-      <w:r>
-        <w:t>JWT Authentication</w:t>
-      </w:r>
-    </w:p>
-    <w:p>
-      <w:pPr>
-        <w:numPr>
-          <w:ilvl w:val="0"/>
-          <w:numId w:val="4"/>
-        </w:numPr>
-      </w:pPr>
-      <w:proofErr w:type="spellStart"/>
-      <w:r>
-        <w:t>bcryptjs</w:t>
-      </w:r>
-      <w:proofErr w:type="spellEnd"/>
-    </w:p>
-    <w:p>
-      <w:pPr>
-        <w:numPr>
-          <w:ilvl w:val="0"/>
-          <w:numId w:val="4"/>
-        </w:numPr>
-      </w:pPr>
-      <w:r>
-        <w:t>Multer</w:t>
-      </w:r>
-    </w:p>
-    <w:p>
-      <w:pPr>
-        <w:numPr>
-          <w:ilvl w:val="0"/>
-          <w:numId w:val="4"/>
-        </w:numPr>
-      </w:pPr>
-      <w:r>
-        <w:t>Zod</w:t>
-      </w:r>
-    </w:p>
-    <w:p>
-      <w:pPr>
-        <w:numPr>
-          <w:ilvl w:val="0"/>
-          <w:numId w:val="4"/>
-        </w:numPr>
-      </w:pPr>
-      <w:r>
-        <w:t>pdf-parse</w:t>
-      </w:r>
-    </w:p>
-    <w:p>
-      <w:pPr>
-        <w:rPr>
-          <w:b/>
-          <w:bCs/>
-        </w:rPr>
-      </w:pPr>
-      <w:r>
-        <w:rPr>
-          <w:b/>
-          <w:bCs/>
-        </w:rPr>
-        <w:t>Database</w:t>
-      </w:r>
-    </w:p>
-    <w:p>
-      <w:pPr>
-        <w:numPr>
-          <w:ilvl w:val="0"/>
-          <w:numId w:val="5"/>
-        </w:numPr>
-      </w:pPr>
-      <w:r>
-        <w:t>MongoDB Atlas</w:t>
-      </w:r>
-    </w:p>
-    <w:p>
-      <w:pPr>
-        <w:numPr>
-          <w:ilvl w:val="0"/>
-          <w:numId w:val="5"/>
-        </w:numPr>
-      </w:pPr>
-      <w:r>
-        <w:t>Mongoose</w:t>
-      </w:r>
-    </w:p>
-    <w:p>
-      <w:pPr>
-        <w:rPr>
-          <w:b/>
-          <w:bCs/>
-        </w:rPr>
-      </w:pPr>
-      <w:r>
-        <w:rPr>
-          <w:b/>
-          <w:bCs/>
-        </w:rPr>
-        <w:t>AI</w:t>
-      </w:r>
-    </w:p>
-    <w:p>
-      <w:pPr>
-        <w:numPr>
-          <w:ilvl w:val="0"/>
-          <w:numId w:val="6"/>
-        </w:numPr>
-      </w:pPr>
-      <w:r>
-        <w:t>Google Gemini API</w:t>
-      </w:r>
-    </w:p>
-    <w:p>
-      <w:pPr>
-        <w:numPr>
-          <w:ilvl w:val="0"/>
-          <w:numId w:val="6"/>
-        </w:numPr>
-      </w:pPr>
-      <w:r>
-        <w:t>Prompt Engineering</w:t>
-      </w:r>
-    </w:p>
-    <w:p>
-      <w:pPr>
-        <w:numPr>
-          <w:ilvl w:val="0"/>
-          <w:numId w:val="6"/>
-        </w:numPr>
-      </w:pPr>
-      <w:r>
-        <w:t>Response Schema</w:t>
-      </w:r>
-    </w:p>
-    <w:p>
-      <w:pPr>
-        <w:numPr>
-          <w:ilvl w:val="0"/>
-          <w:numId w:val="6"/>
-        </w:numPr>
-      </w:pPr>
-      <w:r>
-        <w:t>Structured JSON Output</w:t>
-      </w:r>
-    </w:p>
-    <w:p>
-      <w:pPr>
-        <w:rPr>
-          <w:b/>
-          <w:bCs/>
-        </w:rPr>
-      </w:pPr>
-      <w:r>
-        <w:rPr>
-          <w:b/>
-          <w:bCs/>
-        </w:rPr>
-        <w:t>PDF</w:t>
-      </w:r>
-    </w:p>
-    <w:p>
-      <w:pPr>
-        <w:numPr>
-          <w:ilvl w:val="0"/>
-          <w:numId w:val="7"/>
-        </w:numPr>
-      </w:pPr>
-      <w:r>
-        <w:t>Puppeteer</w:t>
-      </w:r>
-    </w:p>
-    <w:p>
-      <w:pPr>
-        <w:rPr>
-          <w:b/>
-          <w:bCs/>
-        </w:rPr>
-      </w:pPr>
-      <w:r>
-        <w:rPr>
-          <w:b/>
-          <w:bCs/>
-        </w:rPr>
-        <w:t>Authentication</w:t>
+        <w:t>JWT</w:t>
       </w:r>
     </w:p>
     <w:p>
@@ -610,7 +708,7 @@
         </w:numPr>
       </w:pPr>
       <w:r>
-        <w:t>JWT</w:t>
+        <w:t>Access Token</w:t>
       </w:r>
     </w:p>
     <w:p>
@@ -621,7 +719,7 @@
         </w:numPr>
       </w:pPr>
       <w:r>
-        <w:t>Access Token</w:t>
+        <w:t>Refresh Token (Optional)</w:t>
       </w:r>
     </w:p>
     <w:p>
@@ -632,17 +730,6 @@
         </w:numPr>
       </w:pPr>
       <w:r>
-        <w:t>Refresh Token (Optional)</w:t>
-      </w:r>
-    </w:p>
-    <w:p>
-      <w:pPr>
-        <w:numPr>
-          <w:ilvl w:val="0"/>
-          <w:numId w:val="8"/>
-        </w:numPr>
-      </w:pPr>
-      <w:r>
         <w:t>Token Blacklisting</w:t>
       </w:r>
     </w:p>
@@ -658,7 +745,6 @@
           <w:b/>
           <w:bCs/>
         </w:rPr>
-        <w:lastRenderedPageBreak/>
         <w:t>Storage</w:t>
       </w:r>
     </w:p>
@@ -906,6 +992,7 @@
         </w:numPr>
       </w:pPr>
       <w:r>
+        <w:lastRenderedPageBreak/>
         <w:t>Dashboard</w:t>
       </w:r>
     </w:p>
@@ -950,7 +1037,6 @@
         </w:numPr>
       </w:pPr>
       <w:r>
-        <w:lastRenderedPageBreak/>
         <w:t>ATS Resume Builder</w:t>
       </w:r>
     </w:p>
@@ -1180,6 +1266,7 @@
     </w:p>
     <w:p>
       <w:r>
+        <w:lastRenderedPageBreak/>
         <w:t>config/</w:t>
       </w:r>
       <w:r>
@@ -1204,9 +1291,6 @@
       </w:r>
       <w:r>
         <w:br/>
-      </w:r>
-      <w:r>
-        <w:lastRenderedPageBreak/>
         <w:t>utils/</w:t>
       </w:r>
       <w:r>
@@ -1403,6 +1487,7 @@
         </w:numPr>
       </w:pPr>
       <w:r>
+        <w:lastRenderedPageBreak/>
         <w:t>AI Score</w:t>
       </w:r>
     </w:p>
@@ -1447,7 +1532,6 @@
         </w:numPr>
       </w:pPr>
       <w:r>
-        <w:lastRenderedPageBreak/>
         <w:t>Suggestions</w:t>
       </w:r>
     </w:p>
@@ -1682,6 +1766,7 @@
     </w:p>
     <w:p>
       <w:r>
+        <w:lastRenderedPageBreak/>
         <w:t>Resume Upload</w:t>
       </w:r>
     </w:p>
@@ -1720,236 +1805,247 @@
     </w:p>
     <w:p>
       <w:r>
+        <w:t>Resume Analysis</w:t>
+      </w:r>
+    </w:p>
+    <w:p>
+      <w:pPr>
+        <w:numPr>
+          <w:ilvl w:val="0"/>
+          <w:numId w:val="26"/>
+        </w:numPr>
+      </w:pPr>
+      <w:r>
+        <w:t>Resume Summary</w:t>
+      </w:r>
+    </w:p>
+    <w:p>
+      <w:pPr>
+        <w:numPr>
+          <w:ilvl w:val="0"/>
+          <w:numId w:val="26"/>
+        </w:numPr>
+      </w:pPr>
+      <w:r>
+        <w:t>Skills</w:t>
+      </w:r>
+    </w:p>
+    <w:p>
+      <w:pPr>
+        <w:numPr>
+          <w:ilvl w:val="0"/>
+          <w:numId w:val="26"/>
+        </w:numPr>
+      </w:pPr>
+      <w:r>
+        <w:t>Experience</w:t>
+      </w:r>
+    </w:p>
+    <w:p>
+      <w:pPr>
+        <w:numPr>
+          <w:ilvl w:val="0"/>
+          <w:numId w:val="26"/>
+        </w:numPr>
+      </w:pPr>
+      <w:r>
+        <w:t>Education</w:t>
+      </w:r>
+    </w:p>
+    <w:p>
+      <w:pPr>
+        <w:numPr>
+          <w:ilvl w:val="0"/>
+          <w:numId w:val="26"/>
+        </w:numPr>
+      </w:pPr>
+      <w:r>
+        <w:t>Projects</w:t>
+      </w:r>
+    </w:p>
+    <w:p>
+      <w:r>
+        <w:t>Job Description Analysis</w:t>
+      </w:r>
+    </w:p>
+    <w:p>
+      <w:pPr>
+        <w:numPr>
+          <w:ilvl w:val="0"/>
+          <w:numId w:val="27"/>
+        </w:numPr>
+      </w:pPr>
+      <w:r>
+        <w:t>Parse JD</w:t>
+      </w:r>
+    </w:p>
+    <w:p>
+      <w:pPr>
+        <w:numPr>
+          <w:ilvl w:val="0"/>
+          <w:numId w:val="27"/>
+        </w:numPr>
+      </w:pPr>
+      <w:r>
+        <w:t>Required Skills</w:t>
+      </w:r>
+    </w:p>
+    <w:p>
+      <w:pPr>
+        <w:numPr>
+          <w:ilvl w:val="0"/>
+          <w:numId w:val="27"/>
+        </w:numPr>
+      </w:pPr>
+      <w:r>
+        <w:t>Experience</w:t>
+      </w:r>
+    </w:p>
+    <w:p>
+      <w:pPr>
+        <w:numPr>
+          <w:ilvl w:val="0"/>
+          <w:numId w:val="27"/>
+        </w:numPr>
+      </w:pPr>
+      <w:r>
+        <w:t>Keywords</w:t>
+      </w:r>
+    </w:p>
+    <w:p>
+      <w:r>
+        <w:t>Skill Gap Analysis</w:t>
+      </w:r>
+    </w:p>
+    <w:p>
+      <w:pPr>
+        <w:numPr>
+          <w:ilvl w:val="0"/>
+          <w:numId w:val="28"/>
+        </w:numPr>
+      </w:pPr>
+      <w:r>
+        <w:t>Matching Skills</w:t>
+      </w:r>
+    </w:p>
+    <w:p>
+      <w:pPr>
+        <w:numPr>
+          <w:ilvl w:val="0"/>
+          <w:numId w:val="28"/>
+        </w:numPr>
+      </w:pPr>
+      <w:r>
+        <w:t>Missing Skills</w:t>
+      </w:r>
+    </w:p>
+    <w:p>
+      <w:pPr>
+        <w:numPr>
+          <w:ilvl w:val="0"/>
+          <w:numId w:val="28"/>
+        </w:numPr>
+      </w:pPr>
+      <w:r>
+        <w:t>Improvement Suggestions</w:t>
+      </w:r>
+    </w:p>
+    <w:p>
+      <w:pPr>
+        <w:numPr>
+          <w:ilvl w:val="0"/>
+          <w:numId w:val="28"/>
+        </w:numPr>
+      </w:pPr>
+      <w:r>
+        <w:t>Match Percentage</w:t>
+      </w:r>
+    </w:p>
+    <w:p>
+      <w:r>
+        <w:t>Interview Preparation</w:t>
+      </w:r>
+    </w:p>
+    <w:p>
+      <w:r>
+        <w:t>Generate</w:t>
+      </w:r>
+    </w:p>
+    <w:p>
+      <w:pPr>
+        <w:numPr>
+          <w:ilvl w:val="0"/>
+          <w:numId w:val="29"/>
+        </w:numPr>
+      </w:pPr>
+      <w:r>
+        <w:t>HR Questions</w:t>
+      </w:r>
+    </w:p>
+    <w:p>
+      <w:pPr>
+        <w:numPr>
+          <w:ilvl w:val="0"/>
+          <w:numId w:val="29"/>
+        </w:numPr>
+      </w:pPr>
+      <w:r>
+        <w:t>Technical Questions</w:t>
+      </w:r>
+    </w:p>
+    <w:p>
+      <w:pPr>
+        <w:numPr>
+          <w:ilvl w:val="0"/>
+          <w:numId w:val="29"/>
+        </w:numPr>
+      </w:pPr>
+      <w:r>
+        <w:t>Coding Questions</w:t>
+      </w:r>
+    </w:p>
+    <w:p>
+      <w:pPr>
+        <w:numPr>
+          <w:ilvl w:val="0"/>
+          <w:numId w:val="29"/>
+        </w:numPr>
+      </w:pPr>
+      <w:proofErr w:type="spellStart"/>
+      <w:r>
+        <w:t>Behavioral</w:t>
+      </w:r>
+      <w:proofErr w:type="spellEnd"/>
+      <w:r>
+        <w:t xml:space="preserve"> Questions</w:t>
+      </w:r>
+    </w:p>
+    <w:p>
+      <w:pPr>
+        <w:numPr>
+          <w:ilvl w:val="0"/>
+          <w:numId w:val="29"/>
+        </w:numPr>
+      </w:pPr>
+      <w:r>
+        <w:t>Project Questions</w:t>
+      </w:r>
+    </w:p>
+    <w:p>
+      <w:r>
+        <w:t>AI Report</w:t>
+      </w:r>
+    </w:p>
+    <w:p>
+      <w:pPr>
+        <w:numPr>
+          <w:ilvl w:val="0"/>
+          <w:numId w:val="30"/>
+        </w:numPr>
+      </w:pPr>
+      <w:r>
         <w:lastRenderedPageBreak/>
-        <w:t>Resume Analysis</w:t>
-      </w:r>
-    </w:p>
-    <w:p>
-      <w:pPr>
-        <w:numPr>
-          <w:ilvl w:val="0"/>
-          <w:numId w:val="26"/>
-        </w:numPr>
-      </w:pPr>
-      <w:r>
-        <w:t>Resume Summary</w:t>
-      </w:r>
-    </w:p>
-    <w:p>
-      <w:pPr>
-        <w:numPr>
-          <w:ilvl w:val="0"/>
-          <w:numId w:val="26"/>
-        </w:numPr>
-      </w:pPr>
-      <w:r>
-        <w:t>Skills</w:t>
-      </w:r>
-    </w:p>
-    <w:p>
-      <w:pPr>
-        <w:numPr>
-          <w:ilvl w:val="0"/>
-          <w:numId w:val="26"/>
-        </w:numPr>
-      </w:pPr>
-      <w:r>
-        <w:t>Experience</w:t>
-      </w:r>
-    </w:p>
-    <w:p>
-      <w:pPr>
-        <w:numPr>
-          <w:ilvl w:val="0"/>
-          <w:numId w:val="26"/>
-        </w:numPr>
-      </w:pPr>
-      <w:r>
-        <w:t>Education</w:t>
-      </w:r>
-    </w:p>
-    <w:p>
-      <w:pPr>
-        <w:numPr>
-          <w:ilvl w:val="0"/>
-          <w:numId w:val="26"/>
-        </w:numPr>
-      </w:pPr>
-      <w:r>
-        <w:t>Projects</w:t>
-      </w:r>
-    </w:p>
-    <w:p>
-      <w:r>
-        <w:t>Job Description Analysis</w:t>
-      </w:r>
-    </w:p>
-    <w:p>
-      <w:pPr>
-        <w:numPr>
-          <w:ilvl w:val="0"/>
-          <w:numId w:val="27"/>
-        </w:numPr>
-      </w:pPr>
-      <w:r>
-        <w:t>Parse JD</w:t>
-      </w:r>
-    </w:p>
-    <w:p>
-      <w:pPr>
-        <w:numPr>
-          <w:ilvl w:val="0"/>
-          <w:numId w:val="27"/>
-        </w:numPr>
-      </w:pPr>
-      <w:r>
-        <w:t>Required Skills</w:t>
-      </w:r>
-    </w:p>
-    <w:p>
-      <w:pPr>
-        <w:numPr>
-          <w:ilvl w:val="0"/>
-          <w:numId w:val="27"/>
-        </w:numPr>
-      </w:pPr>
-      <w:r>
-        <w:t>Experience</w:t>
-      </w:r>
-    </w:p>
-    <w:p>
-      <w:pPr>
-        <w:numPr>
-          <w:ilvl w:val="0"/>
-          <w:numId w:val="27"/>
-        </w:numPr>
-      </w:pPr>
-      <w:r>
-        <w:t>Keywords</w:t>
-      </w:r>
-    </w:p>
-    <w:p>
-      <w:r>
-        <w:t>Skill Gap Analysis</w:t>
-      </w:r>
-    </w:p>
-    <w:p>
-      <w:pPr>
-        <w:numPr>
-          <w:ilvl w:val="0"/>
-          <w:numId w:val="28"/>
-        </w:numPr>
-      </w:pPr>
-      <w:r>
-        <w:t>Matching Skills</w:t>
-      </w:r>
-    </w:p>
-    <w:p>
-      <w:pPr>
-        <w:numPr>
-          <w:ilvl w:val="0"/>
-          <w:numId w:val="28"/>
-        </w:numPr>
-      </w:pPr>
-      <w:r>
-        <w:t>Missing Skills</w:t>
-      </w:r>
-    </w:p>
-    <w:p>
-      <w:pPr>
-        <w:numPr>
-          <w:ilvl w:val="0"/>
-          <w:numId w:val="28"/>
-        </w:numPr>
-      </w:pPr>
-      <w:r>
-        <w:t>Improvement Suggestions</w:t>
-      </w:r>
-    </w:p>
-    <w:p>
-      <w:pPr>
-        <w:numPr>
-          <w:ilvl w:val="0"/>
-          <w:numId w:val="28"/>
-        </w:numPr>
-      </w:pPr>
-      <w:r>
-        <w:t>Match Percentage</w:t>
-      </w:r>
-    </w:p>
-    <w:p>
-      <w:r>
-        <w:t>Interview Preparation</w:t>
-      </w:r>
-    </w:p>
-    <w:p>
-      <w:r>
-        <w:t>Generate</w:t>
-      </w:r>
-    </w:p>
-    <w:p>
-      <w:pPr>
-        <w:numPr>
-          <w:ilvl w:val="0"/>
-          <w:numId w:val="29"/>
-        </w:numPr>
-      </w:pPr>
-      <w:r>
-        <w:t>HR Questions</w:t>
-      </w:r>
-    </w:p>
-    <w:p>
-      <w:pPr>
-        <w:numPr>
-          <w:ilvl w:val="0"/>
-          <w:numId w:val="29"/>
-        </w:numPr>
-      </w:pPr>
-      <w:r>
-        <w:t>Technical Questions</w:t>
-      </w:r>
-    </w:p>
-    <w:p>
-      <w:pPr>
-        <w:numPr>
-          <w:ilvl w:val="0"/>
-          <w:numId w:val="29"/>
-        </w:numPr>
-      </w:pPr>
-      <w:r>
-        <w:t>Coding Questions</w:t>
-      </w:r>
-    </w:p>
-    <w:p>
-      <w:pPr>
-        <w:numPr>
-          <w:ilvl w:val="0"/>
-          <w:numId w:val="29"/>
-        </w:numPr>
-      </w:pPr>
-      <w:proofErr w:type="spellStart"/>
-      <w:r>
-        <w:t>Behavioral</w:t>
-      </w:r>
-      <w:proofErr w:type="spellEnd"/>
-      <w:r>
-        <w:t xml:space="preserve"> Questions</w:t>
-      </w:r>
-    </w:p>
-    <w:p>
-      <w:pPr>
-        <w:numPr>
-          <w:ilvl w:val="0"/>
-          <w:numId w:val="29"/>
-        </w:numPr>
-      </w:pPr>
-      <w:r>
-        <w:t>Project Questions</w:t>
-      </w:r>
-    </w:p>
-    <w:p>
-      <w:r>
-        <w:t>AI Report</w:t>
+        <w:t>Resume Score</w:t>
       </w:r>
     </w:p>
     <w:p>
@@ -1960,7 +2056,7 @@
         </w:numPr>
       </w:pPr>
       <w:r>
-        <w:t>Resume Score</w:t>
+        <w:t>ATS Score</w:t>
       </w:r>
     </w:p>
     <w:p>
@@ -1971,7 +2067,7 @@
         </w:numPr>
       </w:pPr>
       <w:r>
-        <w:t>ATS Score</w:t>
+        <w:t>Match Score</w:t>
       </w:r>
     </w:p>
     <w:p>
@@ -1982,7 +2078,7 @@
         </w:numPr>
       </w:pPr>
       <w:r>
-        <w:t>Match Score</w:t>
+        <w:t>Strengths</w:t>
       </w:r>
     </w:p>
     <w:p>
@@ -1993,18 +2089,6 @@
         </w:numPr>
       </w:pPr>
       <w:r>
-        <w:t>Strengths</w:t>
-      </w:r>
-    </w:p>
-    <w:p>
-      <w:pPr>
-        <w:numPr>
-          <w:ilvl w:val="0"/>
-          <w:numId w:val="30"/>
-        </w:numPr>
-      </w:pPr>
-      <w:r>
-        <w:lastRenderedPageBreak/>
         <w:t>Weaknesses</w:t>
       </w:r>
     </w:p>
@@ -2233,6 +2317,7 @@
         </w:numPr>
       </w:pPr>
       <w:r>
+        <w:lastRenderedPageBreak/>
         <w:t>Education</w:t>
       </w:r>
     </w:p>
@@ -2265,7 +2350,6 @@
     </w:p>
     <w:p>
       <w:r>
-        <w:lastRenderedPageBreak/>
         <w:t>Compare Resume</w:t>
       </w:r>
     </w:p>
@@ -2452,6 +2536,7 @@
     </w:p>
     <w:p>
       <w:r>
+        <w:lastRenderedPageBreak/>
         <w:t>User Uploads Resume</w:t>
       </w:r>
     </w:p>
@@ -2472,7 +2557,6 @@
     </w:p>
     <w:p>
       <w:r>
-        <w:lastRenderedPageBreak/>
         <w:t>User Pastes Job Description</w:t>
       </w:r>
     </w:p>
@@ -2665,6 +2749,7 @@
         </w:numPr>
       </w:pPr>
       <w:r>
+        <w:lastRenderedPageBreak/>
         <w:t>Secure Cookies (Optional)</w:t>
       </w:r>
     </w:p>
@@ -2697,7 +2782,6 @@
     </w:p>
     <w:p>
       <w:r>
-        <w:lastRenderedPageBreak/>
         <w:t>User API</w:t>
       </w:r>
     </w:p>
@@ -2846,6 +2930,7 @@
     </w:p>
     <w:p>
       <w:r>
+        <w:lastRenderedPageBreak/>
         <w:t>Reusable Components</w:t>
       </w:r>
     </w:p>
@@ -2866,7 +2951,6 @@
     </w:p>
     <w:p>
       <w:r>
-        <w:lastRenderedPageBreak/>
         <w:t>Loading States</w:t>
       </w:r>
     </w:p>
@@ -2999,6 +3083,7 @@
     </w:p>
     <w:p>
       <w:r>
+        <w:lastRenderedPageBreak/>
         <w:t>Mobile Application</w:t>
       </w:r>
     </w:p>
@@ -3026,142 +3111,142 @@
     </w:p>
     <w:p>
       <w:r>
+        <w:t>Phase 1</w:t>
+      </w:r>
+      <w:r>
+        <w:br/>
+        <w:t>Project Setup</w:t>
+      </w:r>
+    </w:p>
+    <w:p>
+      <w:r>
+        <w:t>Phase 2</w:t>
+      </w:r>
+      <w:r>
+        <w:br/>
+        <w:t>Authentication</w:t>
+      </w:r>
+    </w:p>
+    <w:p>
+      <w:r>
+        <w:t>Phase 3</w:t>
+      </w:r>
+      <w:r>
+        <w:br/>
+        <w:t>Dashboard UI</w:t>
+      </w:r>
+    </w:p>
+    <w:p>
+      <w:r>
+        <w:t>Phase 4</w:t>
+      </w:r>
+      <w:r>
+        <w:br/>
+        <w:t>Resume Upload</w:t>
+      </w:r>
+    </w:p>
+    <w:p>
+      <w:r>
+        <w:t>Phase 5</w:t>
+      </w:r>
+      <w:r>
+        <w:br/>
+        <w:t>Resume Parsing</w:t>
+      </w:r>
+    </w:p>
+    <w:p>
+      <w:r>
+        <w:t>Phase 6</w:t>
+      </w:r>
+      <w:r>
+        <w:br/>
+        <w:t>Gemini AI Integration</w:t>
+      </w:r>
+    </w:p>
+    <w:p>
+      <w:r>
+        <w:t>Phase 7</w:t>
+      </w:r>
+      <w:r>
+        <w:br/>
+        <w:t>Skill Gap Analysis</w:t>
+      </w:r>
+    </w:p>
+    <w:p>
+      <w:r>
+        <w:t>Phase 8</w:t>
+      </w:r>
+      <w:r>
+        <w:br/>
+        <w:t>Interview Question Generation</w:t>
+      </w:r>
+    </w:p>
+    <w:p>
+      <w:r>
+        <w:t>Phase 9</w:t>
+      </w:r>
+      <w:r>
+        <w:br/>
+        <w:t>ATS Resume Builder</w:t>
+      </w:r>
+    </w:p>
+    <w:p>
+      <w:r>
+        <w:t>Phase 10</w:t>
+      </w:r>
+      <w:r>
+        <w:br/>
+        <w:t>History Module</w:t>
+      </w:r>
+    </w:p>
+    <w:p>
+      <w:r>
+        <w:t>Phase 11</w:t>
+      </w:r>
+      <w:r>
+        <w:br/>
+        <w:t>Profile Module</w:t>
+      </w:r>
+    </w:p>
+    <w:p>
+      <w:r>
+        <w:t>Phase 12</w:t>
+      </w:r>
+      <w:r>
+        <w:br/>
+        <w:t>Email System</w:t>
+      </w:r>
+    </w:p>
+    <w:p>
+      <w:r>
+        <w:t>Phase 13</w:t>
+      </w:r>
+      <w:r>
+        <w:br/>
+        <w:t>Deployment</w:t>
+      </w:r>
+    </w:p>
+    <w:p>
+      <w:r>
+        <w:t>Phase 14</w:t>
+      </w:r>
+      <w:r>
+        <w:br/>
+        <w:t>Testing</w:t>
+      </w:r>
+    </w:p>
+    <w:p>
+      <w:r>
+        <w:t>Phase 15</w:t>
+      </w:r>
+      <w:r>
+        <w:br/>
+        <w:t>Production Optimization</w:t>
+      </w:r>
+    </w:p>
+    <w:p>
+      <w:r>
         <w:lastRenderedPageBreak/>
-        <w:t>Phase 1</w:t>
-      </w:r>
-      <w:r>
-        <w:br/>
-        <w:t>Project Setup</w:t>
-      </w:r>
-    </w:p>
-    <w:p>
-      <w:r>
-        <w:t>Phase 2</w:t>
-      </w:r>
-      <w:r>
-        <w:br/>
-        <w:t>Authentication</w:t>
-      </w:r>
-    </w:p>
-    <w:p>
-      <w:r>
-        <w:t>Phase 3</w:t>
-      </w:r>
-      <w:r>
-        <w:br/>
-        <w:t>Dashboard UI</w:t>
-      </w:r>
-    </w:p>
-    <w:p>
-      <w:r>
-        <w:t>Phase 4</w:t>
-      </w:r>
-      <w:r>
-        <w:br/>
-        <w:t>Resume Upload</w:t>
-      </w:r>
-    </w:p>
-    <w:p>
-      <w:r>
-        <w:t>Phase 5</w:t>
-      </w:r>
-      <w:r>
-        <w:br/>
-        <w:t>Resume Parsing</w:t>
-      </w:r>
-    </w:p>
-    <w:p>
-      <w:r>
-        <w:t>Phase 6</w:t>
-      </w:r>
-      <w:r>
-        <w:br/>
-        <w:t>Gemini AI Integration</w:t>
-      </w:r>
-    </w:p>
-    <w:p>
-      <w:r>
-        <w:t>Phase 7</w:t>
-      </w:r>
-      <w:r>
-        <w:br/>
-        <w:t>Skill Gap Analysis</w:t>
-      </w:r>
-    </w:p>
-    <w:p>
-      <w:r>
-        <w:t>Phase 8</w:t>
-      </w:r>
-      <w:r>
-        <w:br/>
-        <w:t>Interview Question Generation</w:t>
-      </w:r>
-    </w:p>
-    <w:p>
-      <w:r>
-        <w:t>Phase 9</w:t>
-      </w:r>
-      <w:r>
-        <w:br/>
-        <w:t>ATS Resume Builder</w:t>
-      </w:r>
-    </w:p>
-    <w:p>
-      <w:r>
-        <w:t>Phase 10</w:t>
-      </w:r>
-      <w:r>
-        <w:br/>
-        <w:t>History Module</w:t>
-      </w:r>
-    </w:p>
-    <w:p>
-      <w:r>
-        <w:t>Phase 11</w:t>
-      </w:r>
-      <w:r>
-        <w:br/>
-        <w:t>Profile Module</w:t>
-      </w:r>
-    </w:p>
-    <w:p>
-      <w:r>
-        <w:t>Phase 12</w:t>
-      </w:r>
-      <w:r>
-        <w:br/>
-        <w:t>Email System</w:t>
-      </w:r>
-    </w:p>
-    <w:p>
-      <w:r>
-        <w:t>Phase 13</w:t>
-      </w:r>
-      <w:r>
-        <w:br/>
-        <w:t>Deployment</w:t>
-      </w:r>
-    </w:p>
-    <w:p>
-      <w:r>
-        <w:t>Phase 14</w:t>
-      </w:r>
-      <w:r>
-        <w:br/>
-        <w:t>Testing</w:t>
-      </w:r>
-    </w:p>
-    <w:p>
-      <w:r>
-        <w:t>Phase 15</w:t>
-      </w:r>
-      <w:r>
-        <w:br/>
-        <w:t>Production Optimization</w:t>
-      </w:r>
-    </w:p>
-    <w:p>
-      <w:r>
         <w:pict w14:anchorId="7ACC557B">
           <v:rect id="_x0000_i1039" style="width:0;height:1.5pt" o:hralign="center" o:hrstd="t" o:hr="t" fillcolor="#a0a0a0" stroked="f"/>
         </w:pict>
@@ -3189,7 +3274,6 @@
     </w:p>
     <w:p>
       <w:r>
-        <w:lastRenderedPageBreak/>
         <w:t>Node.js</w:t>
       </w:r>
     </w:p>
@@ -3324,6 +3408,7 @@
         <w:br/>
       </w:r>
       <w:r>
+        <w:lastRenderedPageBreak/>
         <w:br/>
       </w:r>
       <w:r>
@@ -3342,232 +3427,292 @@
     </w:p>
     <w:p>
       <w:r>
+        <w:t>To make your project look even more like something built in a company, consider adding these:</w:t>
+      </w:r>
+    </w:p>
+    <w:p>
+      <w:pPr>
+        <w:numPr>
+          <w:ilvl w:val="0"/>
+          <w:numId w:val="40"/>
+        </w:numPr>
+      </w:pPr>
+      <w:r>
+        <w:rPr>
+          <w:b/>
+          <w:bCs/>
+        </w:rPr>
+        <w:t>TypeScript</w:t>
+      </w:r>
+      <w:r>
+        <w:t xml:space="preserve"> instead of JavaScript (or migrate later). </w:t>
+      </w:r>
+    </w:p>
+    <w:p>
+      <w:pPr>
+        <w:numPr>
+          <w:ilvl w:val="0"/>
+          <w:numId w:val="40"/>
+        </w:numPr>
+      </w:pPr>
+      <w:r>
+        <w:rPr>
+          <w:b/>
+          <w:bCs/>
+        </w:rPr>
+        <w:t xml:space="preserve">Redux Toolkit or </w:t>
+      </w:r>
+      <w:proofErr w:type="spellStart"/>
+      <w:r>
+        <w:rPr>
+          <w:b/>
+          <w:bCs/>
+        </w:rPr>
+        <w:t>TanStack</w:t>
+      </w:r>
+      <w:proofErr w:type="spellEnd"/>
+      <w:r>
+        <w:rPr>
+          <w:b/>
+          <w:bCs/>
+        </w:rPr>
+        <w:t xml:space="preserve"> Query</w:t>
+      </w:r>
+      <w:r>
+        <w:t xml:space="preserve"> if state management becomes complex. </w:t>
+      </w:r>
+    </w:p>
+    <w:p>
+      <w:pPr>
+        <w:numPr>
+          <w:ilvl w:val="0"/>
+          <w:numId w:val="40"/>
+        </w:numPr>
+      </w:pPr>
+      <w:r>
+        <w:rPr>
+          <w:b/>
+          <w:bCs/>
+        </w:rPr>
+        <w:t>Redis</w:t>
+      </w:r>
+      <w:r>
+        <w:t xml:space="preserve"> for caching and token/session management. </w:t>
+      </w:r>
+    </w:p>
+    <w:p>
+      <w:pPr>
+        <w:numPr>
+          <w:ilvl w:val="0"/>
+          <w:numId w:val="40"/>
+        </w:numPr>
+      </w:pPr>
+      <w:proofErr w:type="spellStart"/>
+      <w:r>
+        <w:rPr>
+          <w:b/>
+          <w:bCs/>
+        </w:rPr>
+        <w:t>BullMQ</w:t>
+      </w:r>
+      <w:proofErr w:type="spellEnd"/>
+      <w:r>
+        <w:t xml:space="preserve"> for background jobs (AI analysis, emails, PDF generation). </w:t>
+      </w:r>
+    </w:p>
+    <w:p>
+      <w:pPr>
+        <w:numPr>
+          <w:ilvl w:val="0"/>
+          <w:numId w:val="40"/>
+        </w:numPr>
+      </w:pPr>
+      <w:proofErr w:type="spellStart"/>
+      <w:r>
+        <w:rPr>
+          <w:b/>
+          <w:bCs/>
+        </w:rPr>
+        <w:t>Cloudinary</w:t>
+      </w:r>
+      <w:proofErr w:type="spellEnd"/>
+      <w:r>
+        <w:t xml:space="preserve"> instead of storing uploaded files locally. </w:t>
+      </w:r>
+    </w:p>
+    <w:p>
+      <w:pPr>
+        <w:numPr>
+          <w:ilvl w:val="0"/>
+          <w:numId w:val="40"/>
+        </w:numPr>
+      </w:pPr>
+      <w:r>
+        <w:rPr>
+          <w:b/>
+          <w:bCs/>
+        </w:rPr>
+        <w:t>Helmet + Express Rate Limit</w:t>
+      </w:r>
+      <w:r>
+        <w:t xml:space="preserve"> for additional security. </w:t>
+      </w:r>
+    </w:p>
+    <w:p>
+      <w:pPr>
+        <w:numPr>
+          <w:ilvl w:val="0"/>
+          <w:numId w:val="40"/>
+        </w:numPr>
+      </w:pPr>
+      <w:r>
+        <w:rPr>
+          <w:b/>
+          <w:bCs/>
+        </w:rPr>
+        <w:t>Winston/Pino</w:t>
+      </w:r>
+      <w:r>
+        <w:t xml:space="preserve"> for structured logging. </w:t>
+      </w:r>
+    </w:p>
+    <w:p>
+      <w:pPr>
+        <w:numPr>
+          <w:ilvl w:val="0"/>
+          <w:numId w:val="40"/>
+        </w:numPr>
+      </w:pPr>
+      <w:r>
+        <w:rPr>
+          <w:b/>
+          <w:bCs/>
+        </w:rPr>
+        <w:t xml:space="preserve">Jest + </w:t>
+      </w:r>
+      <w:proofErr w:type="spellStart"/>
+      <w:r>
+        <w:rPr>
+          <w:b/>
+          <w:bCs/>
+        </w:rPr>
+        <w:t>Supertest</w:t>
+      </w:r>
+      <w:proofErr w:type="spellEnd"/>
+      <w:r>
+        <w:t xml:space="preserve"> for backend testing. </w:t>
+      </w:r>
+    </w:p>
+    <w:p>
+      <w:pPr>
+        <w:numPr>
+          <w:ilvl w:val="0"/>
+          <w:numId w:val="40"/>
+        </w:numPr>
+      </w:pPr>
+      <w:r>
+        <w:rPr>
+          <w:b/>
+          <w:bCs/>
+        </w:rPr>
+        <w:t>GitHub Actions</w:t>
+      </w:r>
+      <w:r>
+        <w:t xml:space="preserve"> for automatic testing and deployment. </w:t>
+      </w:r>
+    </w:p>
+    <w:p>
+      <w:pPr>
+        <w:numPr>
+          <w:ilvl w:val="0"/>
+          <w:numId w:val="40"/>
+        </w:numPr>
+      </w:pPr>
+      <w:r>
+        <w:rPr>
+          <w:b/>
+          <w:bCs/>
+        </w:rPr>
+        <w:t>Docker</w:t>
+      </w:r>
+      <w:r>
+        <w:t xml:space="preserve"> so the entire project can run consistently anywhere.</w:t>
+      </w:r>
+    </w:p>
+    <w:p>
+      <w:r>
+        <w:t>1. Requirement Analysis</w:t>
+      </w:r>
+    </w:p>
+    <w:p>
+      <w:r>
+        <w:t xml:space="preserve">        ↓</w:t>
+      </w:r>
+    </w:p>
+    <w:p>
+      <w:r>
+        <w:t>2. System Design</w:t>
+      </w:r>
+    </w:p>
+    <w:p>
+      <w:r>
+        <w:t xml:space="preserve">        ↓</w:t>
+      </w:r>
+    </w:p>
+    <w:p>
+      <w:r>
+        <w:t>3. Folder Structure</w:t>
+      </w:r>
+    </w:p>
+    <w:p>
+      <w:r>
+        <w:t xml:space="preserve">        ↓</w:t>
+      </w:r>
+    </w:p>
+    <w:p>
+      <w:r>
+        <w:t>4. Database Design</w:t>
+      </w:r>
+    </w:p>
+    <w:p>
+      <w:r>
+        <w:t xml:space="preserve">        ↓</w:t>
+      </w:r>
+    </w:p>
+    <w:p>
+      <w:r>
+        <w:t>5. API Design</w:t>
+      </w:r>
+    </w:p>
+    <w:p>
+      <w:r>
+        <w:t xml:space="preserve">        ↓</w:t>
+      </w:r>
+    </w:p>
+    <w:p>
+      <w:r>
+        <w:t>6. UI Design</w:t>
+      </w:r>
+    </w:p>
+    <w:p>
+      <w:r>
+        <w:t xml:space="preserve">        ↓</w:t>
+      </w:r>
+    </w:p>
+    <w:p>
+      <w:r>
+        <w:t>7. Development</w:t>
+      </w:r>
+    </w:p>
+    <w:p>
+      <w:r>
         <w:lastRenderedPageBreak/>
-        <w:t>To make your project look even more like something built in a company, consider adding these:</w:t>
-      </w:r>
-    </w:p>
-    <w:p>
-      <w:pPr>
-        <w:numPr>
-          <w:ilvl w:val="0"/>
-          <w:numId w:val="40"/>
-        </w:numPr>
-      </w:pPr>
-      <w:r>
-        <w:rPr>
-          <w:b/>
-          <w:bCs/>
-        </w:rPr>
-        <w:t>TypeScript</w:t>
-      </w:r>
-      <w:r>
-        <w:t xml:space="preserve"> instead of JavaScript (or migrate later). </w:t>
-      </w:r>
-    </w:p>
-    <w:p>
-      <w:pPr>
-        <w:numPr>
-          <w:ilvl w:val="0"/>
-          <w:numId w:val="40"/>
-        </w:numPr>
-      </w:pPr>
-      <w:r>
-        <w:rPr>
-          <w:b/>
-          <w:bCs/>
-        </w:rPr>
-        <w:t xml:space="preserve">Redux Toolkit or </w:t>
-      </w:r>
-      <w:proofErr w:type="spellStart"/>
-      <w:r>
-        <w:rPr>
-          <w:b/>
-          <w:bCs/>
-        </w:rPr>
-        <w:t>TanStack</w:t>
-      </w:r>
-      <w:proofErr w:type="spellEnd"/>
-      <w:r>
-        <w:rPr>
-          <w:b/>
-          <w:bCs/>
-        </w:rPr>
-        <w:t xml:space="preserve"> Query</w:t>
-      </w:r>
-      <w:r>
-        <w:t xml:space="preserve"> if state management becomes complex. </w:t>
-      </w:r>
-    </w:p>
-    <w:p>
-      <w:pPr>
-        <w:numPr>
-          <w:ilvl w:val="0"/>
-          <w:numId w:val="40"/>
-        </w:numPr>
-      </w:pPr>
-      <w:r>
-        <w:rPr>
-          <w:b/>
-          <w:bCs/>
-        </w:rPr>
-        <w:t>Redis</w:t>
-      </w:r>
-      <w:r>
-        <w:t xml:space="preserve"> for caching and token/session management. </w:t>
-      </w:r>
-    </w:p>
-    <w:p>
-      <w:pPr>
-        <w:numPr>
-          <w:ilvl w:val="0"/>
-          <w:numId w:val="40"/>
-        </w:numPr>
-      </w:pPr>
-      <w:proofErr w:type="spellStart"/>
-      <w:r>
-        <w:rPr>
-          <w:b/>
-          <w:bCs/>
-        </w:rPr>
-        <w:t>BullMQ</w:t>
-      </w:r>
-      <w:proofErr w:type="spellEnd"/>
-      <w:r>
-        <w:t xml:space="preserve"> for background jobs (AI analysis, emails, PDF generation). </w:t>
-      </w:r>
-    </w:p>
-    <w:p>
-      <w:pPr>
-        <w:numPr>
-          <w:ilvl w:val="0"/>
-          <w:numId w:val="40"/>
-        </w:numPr>
-      </w:pPr>
-      <w:proofErr w:type="spellStart"/>
-      <w:r>
-        <w:rPr>
-          <w:b/>
-          <w:bCs/>
-        </w:rPr>
-        <w:t>Cloudinary</w:t>
-      </w:r>
-      <w:proofErr w:type="spellEnd"/>
-      <w:r>
-        <w:t xml:space="preserve"> instead of storing uploaded files locally. </w:t>
-      </w:r>
-    </w:p>
-    <w:p>
-      <w:pPr>
-        <w:numPr>
-          <w:ilvl w:val="0"/>
-          <w:numId w:val="40"/>
-        </w:numPr>
-      </w:pPr>
-      <w:r>
-        <w:rPr>
-          <w:b/>
-          <w:bCs/>
-        </w:rPr>
-        <w:t>Helmet + Express Rate Limit</w:t>
-      </w:r>
-      <w:r>
-        <w:t xml:space="preserve"> for additional security. </w:t>
-      </w:r>
-    </w:p>
-    <w:p>
-      <w:pPr>
-        <w:numPr>
-          <w:ilvl w:val="0"/>
-          <w:numId w:val="40"/>
-        </w:numPr>
-      </w:pPr>
-      <w:r>
-        <w:rPr>
-          <w:b/>
-          <w:bCs/>
-        </w:rPr>
-        <w:t>Winston/Pino</w:t>
-      </w:r>
-      <w:r>
-        <w:t xml:space="preserve"> for structured logging. </w:t>
-      </w:r>
-    </w:p>
-    <w:p>
-      <w:pPr>
-        <w:numPr>
-          <w:ilvl w:val="0"/>
-          <w:numId w:val="40"/>
-        </w:numPr>
-      </w:pPr>
-      <w:r>
-        <w:rPr>
-          <w:b/>
-          <w:bCs/>
-        </w:rPr>
-        <w:t xml:space="preserve">Jest + </w:t>
-      </w:r>
-      <w:proofErr w:type="spellStart"/>
-      <w:r>
-        <w:rPr>
-          <w:b/>
-          <w:bCs/>
-        </w:rPr>
-        <w:t>Supertest</w:t>
-      </w:r>
-      <w:proofErr w:type="spellEnd"/>
-      <w:r>
-        <w:t xml:space="preserve"> for backend testing. </w:t>
-      </w:r>
-    </w:p>
-    <w:p>
-      <w:pPr>
-        <w:numPr>
-          <w:ilvl w:val="0"/>
-          <w:numId w:val="40"/>
-        </w:numPr>
-      </w:pPr>
-      <w:r>
-        <w:rPr>
-          <w:b/>
-          <w:bCs/>
-        </w:rPr>
-        <w:t>GitHub Actions</w:t>
-      </w:r>
-      <w:r>
-        <w:t xml:space="preserve"> for automatic testing and deployment. </w:t>
-      </w:r>
-    </w:p>
-    <w:p>
-      <w:pPr>
-        <w:numPr>
-          <w:ilvl w:val="0"/>
-          <w:numId w:val="40"/>
-        </w:numPr>
-      </w:pPr>
-      <w:r>
-        <w:rPr>
-          <w:b/>
-          <w:bCs/>
-        </w:rPr>
-        <w:t>Docker</w:t>
-      </w:r>
-      <w:r>
-        <w:t xml:space="preserve"> so the entire project can run consistently anywhere.</w:t>
-      </w:r>
-    </w:p>
-    <w:p>
-      <w:r>
-        <w:t>1. Requirement Analysis</w:t>
-      </w:r>
-    </w:p>
-    <w:p>
-      <w:r>
         <w:t xml:space="preserve">        ↓</w:t>
       </w:r>
     </w:p>
     <w:p>
       <w:r>
-        <w:t>2. System Design</w:t>
+        <w:t>8. Testing</w:t>
       </w:r>
     </w:p>
     <w:p>
@@ -3577,67 +3722,6 @@
     </w:p>
     <w:p>
       <w:r>
-        <w:t>3. Folder Structure</w:t>
-      </w:r>
-    </w:p>
-    <w:p>
-      <w:r>
-        <w:t xml:space="preserve">        ↓</w:t>
-      </w:r>
-    </w:p>
-    <w:p>
-      <w:r>
-        <w:t>4. Database Design</w:t>
-      </w:r>
-    </w:p>
-    <w:p>
-      <w:r>
-        <w:t xml:space="preserve">        ↓</w:t>
-      </w:r>
-    </w:p>
-    <w:p>
-      <w:r>
-        <w:t>5. API Design</w:t>
-      </w:r>
-    </w:p>
-    <w:p>
-      <w:r>
-        <w:t xml:space="preserve">        ↓</w:t>
-      </w:r>
-    </w:p>
-    <w:p>
-      <w:r>
-        <w:t>6. UI Design</w:t>
-      </w:r>
-    </w:p>
-    <w:p>
-      <w:r>
-        <w:t xml:space="preserve">        ↓</w:t>
-      </w:r>
-    </w:p>
-    <w:p>
-      <w:r>
-        <w:t>7. Development</w:t>
-      </w:r>
-    </w:p>
-    <w:p>
-      <w:r>
-        <w:t xml:space="preserve">        ↓</w:t>
-      </w:r>
-    </w:p>
-    <w:p>
-      <w:r>
-        <w:t>8. Testing</w:t>
-      </w:r>
-    </w:p>
-    <w:p>
-      <w:r>
-        <w:t xml:space="preserve">        ↓</w:t>
-      </w:r>
-    </w:p>
-    <w:p>
-      <w:r>
-        <w:lastRenderedPageBreak/>
         <w:t>9. Deployment</w:t>
       </w:r>
     </w:p>
@@ -4237,6 +4321,7 @@
           </w:tcPr>
           <w:p>
             <w:r>
+              <w:lastRenderedPageBreak/>
               <w:t>Production Upgrade</w:t>
             </w:r>
           </w:p>
@@ -4395,75 +4480,85 @@
         <w:rPr>
           <w:rFonts w:ascii="Calibri" w:hAnsi="Calibri" w:cs="Calibri"/>
         </w:rPr>
+        <w:t>─</w:t>
+      </w:r>
+      <w:proofErr w:type="gramStart"/>
+      <w:r>
+        <w:rPr>
+          <w:rFonts w:ascii="Calibri" w:hAnsi="Calibri" w:cs="Calibri"/>
+        </w:rPr>
+        <w:t>─</w:t>
+      </w:r>
+      <w:r>
+        <w:t xml:space="preserve"> .</w:t>
+      </w:r>
+      <w:proofErr w:type="spellStart"/>
+      <w:r>
+        <w:t>gitignore</w:t>
+      </w:r>
+      <w:proofErr w:type="spellEnd"/>
+      <w:proofErr w:type="gramEnd"/>
+      <w:r>
+        <w:br/>
+      </w:r>
+      <w:r>
+        <w:rPr>
+          <w:rFonts w:ascii="Calibri" w:hAnsi="Calibri" w:cs="Calibri"/>
+        </w:rPr>
+        <w:t>│</w:t>
+      </w:r>
+      <w:r>
+        <w:br/>
+      </w:r>
+      <w:r>
+        <w:rPr>
+          <w:rFonts w:ascii="MS Gothic" w:eastAsia="MS Gothic" w:hAnsi="MS Gothic" w:cs="MS Gothic" w:hint="eastAsia"/>
+        </w:rPr>
+        <w:t>├</w:t>
+      </w:r>
+      <w:r>
+        <w:rPr>
+          <w:rFonts w:ascii="Calibri" w:hAnsi="Calibri" w:cs="Calibri"/>
+        </w:rPr>
         <w:t>──</w:t>
       </w:r>
       <w:r>
-        <w:t xml:space="preserve"> .</w:t>
+        <w:t xml:space="preserve"> README.md</w:t>
+      </w:r>
+      <w:r>
+        <w:br/>
+      </w:r>
+      <w:r>
+        <w:rPr>
+          <w:rFonts w:ascii="Calibri" w:hAnsi="Calibri" w:cs="Calibri"/>
+        </w:rPr>
+        <w:t>│</w:t>
+      </w:r>
+      <w:r>
+        <w:br/>
+      </w:r>
+      <w:r>
+        <w:rPr>
+          <w:rFonts w:ascii="MS Gothic" w:eastAsia="MS Gothic" w:hAnsi="MS Gothic" w:cs="MS Gothic" w:hint="eastAsia"/>
+        </w:rPr>
+        <w:t>├</w:t>
+      </w:r>
+      <w:r>
+        <w:rPr>
+          <w:rFonts w:ascii="Calibri" w:hAnsi="Calibri" w:cs="Calibri"/>
+        </w:rPr>
+        <w:t>──</w:t>
+      </w:r>
+      <w:r>
+        <w:t xml:space="preserve"> </w:t>
       </w:r>
       <w:proofErr w:type="spellStart"/>
-      <w:r>
-        <w:t>gitignore</w:t>
+      <w:proofErr w:type="gramStart"/>
+      <w:r>
+        <w:t>package.json</w:t>
       </w:r>
       <w:proofErr w:type="spellEnd"/>
-      <w:r>
-        <w:br/>
-      </w:r>
-      <w:r>
-        <w:rPr>
-          <w:rFonts w:ascii="Calibri" w:hAnsi="Calibri" w:cs="Calibri"/>
-        </w:rPr>
-        <w:t>│</w:t>
-      </w:r>
-      <w:r>
-        <w:br/>
-      </w:r>
-      <w:r>
-        <w:rPr>
-          <w:rFonts w:ascii="MS Gothic" w:eastAsia="MS Gothic" w:hAnsi="MS Gothic" w:cs="MS Gothic" w:hint="eastAsia"/>
-        </w:rPr>
-        <w:t>├</w:t>
-      </w:r>
-      <w:r>
-        <w:rPr>
-          <w:rFonts w:ascii="Calibri" w:hAnsi="Calibri" w:cs="Calibri"/>
-        </w:rPr>
-        <w:t>──</w:t>
-      </w:r>
-      <w:r>
-        <w:t xml:space="preserve"> README.md</w:t>
-      </w:r>
-      <w:r>
-        <w:br/>
-      </w:r>
-      <w:r>
-        <w:rPr>
-          <w:rFonts w:ascii="Calibri" w:hAnsi="Calibri" w:cs="Calibri"/>
-        </w:rPr>
-        <w:t>│</w:t>
-      </w:r>
-      <w:r>
-        <w:br/>
-      </w:r>
-      <w:r>
-        <w:rPr>
-          <w:rFonts w:ascii="MS Gothic" w:eastAsia="MS Gothic" w:hAnsi="MS Gothic" w:cs="MS Gothic" w:hint="eastAsia"/>
-        </w:rPr>
-        <w:t>├</w:t>
-      </w:r>
-      <w:r>
-        <w:rPr>
-          <w:rFonts w:ascii="Calibri" w:hAnsi="Calibri" w:cs="Calibri"/>
-        </w:rPr>
-        <w:t>──</w:t>
-      </w:r>
-      <w:r>
-        <w:t xml:space="preserve"> </w:t>
-      </w:r>
-      <w:proofErr w:type="spellStart"/>
-      <w:r>
-        <w:t>package.json</w:t>
-      </w:r>
-      <w:proofErr w:type="spellEnd"/>
+      <w:proofErr w:type="gramEnd"/>
       <w:r>
         <w:br/>
       </w:r>
@@ -6750,7 +6845,15 @@
     </w:p>
     <w:p>
       <w:r>
-        <w:t>This is used in many production React applications because it keeps related code together and makes the project easier to scale.</w:t>
+        <w:t xml:space="preserve">This is used in many </w:t>
+      </w:r>
+      <w:proofErr w:type="gramStart"/>
+      <w:r>
+        <w:t>production</w:t>
+      </w:r>
+      <w:proofErr w:type="gramEnd"/>
+      <w:r>
+        <w:t xml:space="preserve"> React applications because it keeps related code together and makes the project easier to scale.</w:t>
       </w:r>
     </w:p>
     <w:p>
@@ -7892,12 +7995,25 @@
           <w:numId w:val="41"/>
         </w:numPr>
       </w:pPr>
-      <w:r>
-        <w:t>Create .env and .</w:t>
+      <w:proofErr w:type="gramStart"/>
+      <w:r>
+        <w:t>Create .env</w:t>
+      </w:r>
+      <w:proofErr w:type="gramEnd"/>
+      <w:r>
+        <w:t xml:space="preserve"> </w:t>
+      </w:r>
+      <w:proofErr w:type="gramStart"/>
+      <w:r>
+        <w:t>and .</w:t>
       </w:r>
       <w:proofErr w:type="spellStart"/>
       <w:r>
-        <w:t>env.example</w:t>
+        <w:t>env</w:t>
+      </w:r>
+      <w:proofErr w:type="gramEnd"/>
+      <w:r>
+        <w:t>.example</w:t>
       </w:r>
       <w:proofErr w:type="spellEnd"/>
       <w:r>

</xml_diff>